<commit_message>
Rename the product to Fleet Studio, by Verto Wave
Everything people read now says Fleet Studio: the portal, API messages and
errors, agent and plugin messages, notifications, design sources, READMEs,
the build document and the four Word documents. The portal shows the new
logo in the top bar and on the sign-in page, uses the F mark as the browser
icon and as the system actor in the audit log, and a workspace still named
"Fleet Control" in an existing database is treated as the product's own name.

Internal identifiers keep the old spelling on purpose, because installed
agents, stored blueprints and API clients depend on them: the fleetcontrol_*
packages, apiVersion fleetcontrol/v1, the X-Fleet-Control header,
FLEETCONTROL_* variables and the fleetctl-* host units. Recorded Hermes
captures stay verbatim. CLAUDE.md records the rule.

Co-Authored-By: Claude Opus 5.5 <noreply@anthropic.com>
</commit_message>
<xml_diff>
--- a/docs/grc/Agentic_GRC_on_SAS_Response_and_Plan.docx
+++ b/docs/grc/Agentic_GRC_on_SAS_Response_and_Plan.docx
@@ -4,7 +4,57 @@
   <w:body>
     <w:p>
       <w:pPr>
-        <w:spacing w:after="120" w:before="2400"/>
+        <w:spacing w:before="1400"/>
+      </w:pPr>
+    </w:p>
+    <w:p>
+      <w:pPr>
+        <w:spacing w:after="360"/>
+      </w:pPr>
+      <w:r>
+        <w:drawing>
+          <wp:inline distT="0" distB="0" distL="0" distR="0">
+            <wp:extent cx="2381250" cy="561975"/>
+            <wp:effectExtent t="0" r="0" b="0" l="0"/>
+            <wp:docPr id="1" name="Fleet Studio logo" descr="Fleet Studio by Verto Wave" title="Fleet Studio"/>
+            <wp:cNvGraphicFramePr>
+              <a:graphicFrameLocks xmlns:a="http://schemas.openxmlformats.org/drawingml/2006/main" noChangeAspect="1"/>
+            </wp:cNvGraphicFramePr>
+            <a:graphic xmlns:a="http://schemas.openxmlformats.org/drawingml/2006/main">
+              <a:graphicData uri="http://schemas.openxmlformats.org/drawingml/2006/picture">
+                <pic:pic xmlns:pic="http://schemas.openxmlformats.org/drawingml/2006/picture">
+                  <pic:nvPicPr>
+                    <pic:cNvPr id="0" name="" descr=""/>
+                    <pic:cNvPicPr>
+                      <a:picLocks noChangeAspect="1" noChangeArrowheads="1"/>
+                    </pic:cNvPicPr>
+                  </pic:nvPicPr>
+                  <pic:blipFill>
+                    <a:blip r:embed="rId10" cstate="none"/>
+                    <a:srcRect/>
+                    <a:stretch>
+                      <a:fillRect/>
+                    </a:stretch>
+                  </pic:blipFill>
+                  <pic:spPr bwMode="auto">
+                    <a:xfrm>
+                      <a:off x="0" y="0"/>
+                      <a:ext cx="2381250" cy="561975"/>
+                    </a:xfrm>
+                    <a:prstGeom prst="rect">
+                      <a:avLst/>
+                    </a:prstGeom>
+                  </pic:spPr>
+                </pic:pic>
+              </a:graphicData>
+            </a:graphic>
+          </wp:inline>
+        </w:drawing>
+      </w:r>
+    </w:p>
+    <w:p>
+      <w:pPr>
+        <w:spacing w:after="120" w:before="0"/>
       </w:pPr>
       <w:r>
         <w:rPr>
@@ -244,7 +294,7 @@
                 <w:sz w:val="20"/>
                 <w:szCs w:val="20"/>
               </w:rPr>
-              <w:t xml:space="preserve"> Fleet Control, our control plane for agent fleets, already enforces policies, tests agents before production, grades evidence (Evidence found / No evidence / Not verifiable / Policy blocked), runs workflows with human gates and records decisions in Decision Rooms. It has run end to end against the SAS Viya MCP Server on our lab.</w:t>
+              <w:t xml:space="preserve"> Fleet Studio, our control plane for agent fleets, already enforces policies, tests agents before production, grades evidence (Evidence found / No evidence / Not verifiable / Policy blocked), runs workflows with human gates and records decisions in Decision Rooms. It has run end to end against the SAS Viya MCP Server on our lab.</w:t>
             </w:r>
           </w:p>
           <w:p>
@@ -369,7 +419,7 @@
         <w:t xml:space="preserve">The guardrails.</w:t>
       </w:r>
       <w:r>
-        <w:t xml:space="preserve"> Root cause is a hypothesis, not a fact. Findings cite their records. Thresholds and risk appetite stay deterministic. Material conclusions need human approval. Each of these maps onto a mechanism Fleet Control already enforces (section 5.4).</w:t>
+        <w:t xml:space="preserve"> Root cause is a hypothesis, not a fact. Findings cite their records. Thresholds and risk appetite stay deterministic. Material conclusions need human approval. Each of these maps onto a mechanism Fleet Studio already enforces (section 5.4).</w:t>
       </w:r>
     </w:p>
     <w:p>
@@ -2577,7 +2627,7 @@
                 <w:sz w:val="18"/>
                 <w:szCs w:val="18"/>
               </w:rPr>
-              <w:t xml:space="preserve">The evidence chain from a record to a finding to a decision has to come from our layer. Fleet Control already provides it.</w:t>
+              <w:t xml:space="preserve">The evidence chain from a record to a finding to a decision has to come from our layer. Fleet Studio already provides it.</w:t>
             </w:r>
           </w:p>
         </w:tc>
@@ -2802,7 +2852,7 @@
         <w:spacing w:after="120" w:line="276"/>
       </w:pPr>
       <w:r>
-        <w:t xml:space="preserve">We are not starting from zero. Fleet Control and its SAS integration already cover most of the proposal’s governance layer.</w:t>
+        <w:t xml:space="preserve">We are not starting from zero. Fleet Studio and its SAS integration already cover most of the proposal’s governance layer.</w:t>
       </w:r>
     </w:p>
     <w:tbl>
@@ -4590,7 +4640,7 @@
                 <w:sz w:val="18"/>
                 <w:szCs w:val="18"/>
               </w:rPr>
-              <w:t xml:space="preserve">Fleet Control: blueprints, policy, tests, assurance, workflows, Decision Rooms, audit</w:t>
+              <w:t xml:space="preserve">Fleet Studio: blueprints, policy, tests, assurance, workflows, Decision Rooms, audit</w:t>
             </w:r>
           </w:p>
         </w:tc>
@@ -5138,7 +5188,7 @@
           <w:b/>
           <w:bCs/>
         </w:rPr>
-        <w:t xml:space="preserve">No credentials through Fleet Control.</w:t>
+        <w:t xml:space="preserve">No credentials through Fleet Studio.</w:t>
       </w:r>
       <w:r>
         <w:t xml:space="preserve"> Each agent has its own GCM identity on the customer’s host, like our existing SAS setup.</w:t>
@@ -9026,7 +9076,7 @@
         <w:spacing w:after="60" w:line="264"/>
       </w:pPr>
       <w:r>
-        <w:t xml:space="preserve">Load one real regulation and a sample policy and control library (exported from GCM or taken from a public framework) into a Fleet Control content zone.</w:t>
+        <w:t xml:space="preserve">Load one real regulation and a sample policy and control library (exported from GCM or taken from a public framework) into a Fleet Studio content zone.</w:t>
       </w:r>
     </w:p>
     <w:p>
@@ -9132,7 +9182,7 @@
         <w:spacing w:after="60" w:line="264"/>
       </w:pPr>
       <w:r>
-        <w:t xml:space="preserve">One GCM identity per agent, provisioned and renewed on the customer’s host; nothing passes through Fleet Control.</w:t>
+        <w:t xml:space="preserve">One GCM identity per agent, provisioned and renewed on the customer’s host; nothing passes through Fleet Studio.</w:t>
       </w:r>
     </w:p>
     <w:p>
@@ -9292,7 +9342,7 @@
         <w:spacing w:after="60" w:line="264"/>
       </w:pPr>
       <w:r>
-        <w:t xml:space="preserve">Warn a day ahead of any expiring credential, as Fleet Control already does for MCP logins.</w:t>
+        <w:t xml:space="preserve">Warn a day ahead of any expiring credential, as Fleet Studio already does for MCP logins.</w:t>
       </w:r>
     </w:p>
     <w:p>
@@ -9895,7 +9945,7 @@
                 <w:sz w:val="18"/>
                 <w:szCs w:val="18"/>
               </w:rPr>
-              <w:t xml:space="preserve">Fleet Control engineer</w:t>
+              <w:t xml:space="preserve">Fleet Studio engineer</w:t>
             </w:r>
           </w:p>
         </w:tc>
@@ -11177,7 +11227,7 @@
         <w:t xml:space="preserve">Agree the product boundary:</w:t>
       </w:r>
       <w:r>
-        <w:t xml:space="preserve"> we sell the GRC connector, the GRC Fleet Pack and Fleet Control as one governed product on top of the customer’s SAS licence; we do not replace GCM.</w:t>
+        <w:t xml:space="preserve"> we sell the GRC connector, the GRC Fleet Pack and Fleet Studio as one governed product on top of the customer’s SAS licence; we do not replace GCM.</w:t>
       </w:r>
     </w:p>
     <w:p>
@@ -11198,7 +11248,7 @@
         <w:spacing w:after="80" w:line="264"/>
       </w:pPr>
       <w:r>
-        <w:t xml:space="preserve">Name the integration layer: our GRC connector plus Fleet Control. State plainly that SAS provides no GCM tools for agents today.</w:t>
+        <w:t xml:space="preserve">Name the integration layer: our GRC connector plus Fleet Studio. State plainly that SAS provides no GCM tools for agents today.</w:t>
       </w:r>
     </w:p>
     <w:p>
@@ -26970,7 +27020,7 @@
         </w:rPr>
         <w:t xml:space="preserve">SAS Viya MCP Server (GitHub, tool tiers and read-only mode) — </w:t>
       </w:r>
-      <w:hyperlink w:history="1" r:id="rIdphqzwkqq6l4r7wzrrq6r3">
+      <w:hyperlink w:history="1" r:id="rIdwj7onfgffxdui7yg-ukxy">
         <w:r>
           <w:rPr>
             <w:rStyle w:val="Hyperlink"/>
@@ -26997,7 +27047,7 @@
         </w:rPr>
         <w:t xml:space="preserve">SAS Viya MCP Server product page — </w:t>
       </w:r>
-      <w:hyperlink w:history="1" r:id="rIdvzsizveol_uf0yewfc1i5">
+      <w:hyperlink w:history="1" r:id="rIdyha3pt_zitovrrootzqea">
         <w:r>
           <w:rPr>
             <w:rStyle w:val="Hyperlink"/>
@@ -27024,7 +27074,7 @@
         </w:rPr>
         <w:t xml:space="preserve">SAS press release, SAS Innovate 2026: AI assistants and agentic AI — </w:t>
       </w:r>
-      <w:hyperlink w:history="1" r:id="rIdyc7rtsuot7ux7vs-6g3aq">
+      <w:hyperlink w:history="1" r:id="rIdapgkme1q94zhz4jjptwhm">
         <w:r>
           <w:rPr>
             <w:rStyle w:val="Hyperlink"/>
@@ -27051,7 +27101,7 @@
         </w:rPr>
         <w:t xml:space="preserve">SAS blog: governed banking workflow with the Viya MCP Server — </w:t>
       </w:r>
-      <w:hyperlink w:history="1" r:id="rId9umatft1wzvevp55dapyh">
+      <w:hyperlink w:history="1" r:id="rIdr2jm8ilwvxf22rr_b8kgm">
         <w:r>
           <w:rPr>
             <w:rStyle w:val="Hyperlink"/>
@@ -27078,7 +27128,7 @@
         </w:rPr>
         <w:t xml:space="preserve">SAS Communities: REST APIs in SAS Model Risk Management (riskCirrusObjects) — </w:t>
       </w:r>
-      <w:hyperlink w:history="1" r:id="rIdxzdwxpcfssrtfp5fovfjm">
+      <w:hyperlink w:history="1" r:id="rIdyim556rqf4bv8tqi3zsx7">
         <w:r>
           <w:rPr>
             <w:rStyle w:val="Hyperlink"/>
@@ -27105,7 +27155,7 @@
         </w:rPr>
         <w:t xml:space="preserve">SAS GCM features — </w:t>
       </w:r>
-      <w:hyperlink w:history="1" r:id="rIde69xlj20z9k8et7chj8av">
+      <w:hyperlink w:history="1" r:id="rId1t1sbefrvnu86jum-bbb7">
         <w:r>
           <w:rPr>
             <w:rStyle w:val="Hyperlink"/>
@@ -27132,7 +27182,7 @@
         </w:rPr>
         <w:t xml:space="preserve">SAS GCM support (documentation needs an access key) — </w:t>
       </w:r>
-      <w:hyperlink w:history="1" r:id="rIdji14pzorwkxgkyvipt39p">
+      <w:hyperlink w:history="1" r:id="rIdzruhejmsriaw-dbazzcij">
         <w:r>
           <w:rPr>
             <w:rStyle w:val="Hyperlink"/>
@@ -27159,7 +27209,7 @@
         </w:rPr>
         <w:t xml:space="preserve">SAS Viya Deployment Guide 2025.09 (GCM on Viya, Risk Cirrus Core) — </w:t>
       </w:r>
-      <w:hyperlink w:history="1" r:id="rIdcdr9-utv-hsaq-ixvwmbg">
+      <w:hyperlink w:history="1" r:id="rId-f2x9vadap30-kxgmm9dh">
         <w:r>
           <w:rPr>
             <w:rStyle w:val="Hyperlink"/>
@@ -27180,7 +27230,7 @@
         <w:spacing w:after="60" w:line="264"/>
       </w:pPr>
       <w:r>
-        <w:t xml:space="preserve">Our own lab findings: SAS Viya MCP Server 1.15 and 1.16.1 on SAS Viya, with Hermes Agent 0.21 and Fleet Control, September 2026 (internal integration notes).</w:t>
+        <w:t xml:space="preserve">Our own lab findings: SAS Viya MCP Server 1.15 and 1.16.1 on SAS Viya, with Hermes Agent 0.21 and Fleet Studio, September 2026 (internal integration notes).</w:t>
       </w:r>
     </w:p>
     <w:sectPr>
@@ -27326,15 +27376,53 @@
 <file path=word/header1.xml><?xml version="1.0" encoding="utf-8"?>
 <w:hdr xmlns:wpc="http://schemas.microsoft.com/office/word/2010/wordprocessingCanvas" xmlns:mc="http://schemas.openxmlformats.org/markup-compatibility/2006" xmlns:o="urn:schemas-microsoft-com:office:office" xmlns:r="http://schemas.openxmlformats.org/officeDocument/2006/relationships" xmlns:m="http://schemas.openxmlformats.org/officeDocument/2006/math" xmlns:v="urn:schemas-microsoft-com:vml" xmlns:wp14="http://schemas.microsoft.com/office/word/2010/wordprocessingDrawing" xmlns:wp="http://schemas.openxmlformats.org/drawingml/2006/wordprocessingDrawing" xmlns:w10="urn:schemas-microsoft-com:office:word" xmlns:w="http://schemas.openxmlformats.org/wordprocessingml/2006/main" xmlns:w14="http://schemas.microsoft.com/office/word/2010/wordml" xmlns:w15="http://schemas.microsoft.com/office/word/2012/wordml" xmlns:wpg="http://schemas.microsoft.com/office/word/2010/wordprocessingGroup" xmlns:wpi="http://schemas.microsoft.com/office/word/2010/wordprocessingInk" xmlns:wne="http://schemas.microsoft.com/office/word/2006/wordml" xmlns:wps="http://schemas.microsoft.com/office/word/2010/wordprocessingShape" xmlns:cx="http://schemas.microsoft.com/office/drawing/2014/chartex" xmlns:cx1="http://schemas.microsoft.com/office/drawing/2015/9/8/chartex" xmlns:cx2="http://schemas.microsoft.com/office/drawing/2015/10/21/chartex" xmlns:cx3="http://schemas.microsoft.com/office/drawing/2016/5/9/chartex" xmlns:cx4="http://schemas.microsoft.com/office/drawing/2016/5/10/chartex" xmlns:cx5="http://schemas.microsoft.com/office/drawing/2016/5/11/chartex" xmlns:cx6="http://schemas.microsoft.com/office/drawing/2016/5/12/chartex" xmlns:cx7="http://schemas.microsoft.com/office/drawing/2016/5/13/chartex" xmlns:cx8="http://schemas.microsoft.com/office/drawing/2016/5/14/chartex" xmlns:w16cid="http://schemas.microsoft.com/office/word/2016/wordml/cid" xmlns:w16se="http://schemas.microsoft.com/office/word/2015/wordml/symex">
   <w:p>
-    <w:pPr>
-      <w:jc w:val="right"/>
-    </w:pPr>
+    <w:r>
+      <w:drawing>
+        <wp:inline distT="0" distB="0" distL="0" distR="0">
+          <wp:extent cx="876300" cy="209550"/>
+          <wp:effectExtent t="0" r="0" b="0" l="0"/>
+          <wp:docPr id="2" name="Fleet Studio logo" descr="Fleet Studio by Verto Wave" title="Fleet Studio"/>
+          <wp:cNvGraphicFramePr>
+            <a:graphicFrameLocks xmlns:a="http://schemas.openxmlformats.org/drawingml/2006/main" noChangeAspect="1"/>
+          </wp:cNvGraphicFramePr>
+          <a:graphic xmlns:a="http://schemas.openxmlformats.org/drawingml/2006/main">
+            <a:graphicData uri="http://schemas.openxmlformats.org/drawingml/2006/picture">
+              <pic:pic xmlns:pic="http://schemas.openxmlformats.org/drawingml/2006/picture">
+                <pic:nvPicPr>
+                  <pic:cNvPr id="0" name="" descr=""/>
+                  <pic:cNvPicPr>
+                    <a:picLocks noChangeAspect="1" noChangeArrowheads="1"/>
+                  </pic:cNvPicPr>
+                </pic:nvPicPr>
+                <pic:blipFill>
+                  <a:blip r:embed="rId0" cstate="none"/>
+                  <a:srcRect/>
+                  <a:stretch>
+                    <a:fillRect/>
+                  </a:stretch>
+                </pic:blipFill>
+                <pic:spPr bwMode="auto">
+                  <a:xfrm>
+                    <a:off x="0" y="0"/>
+                    <a:ext cx="876300" cy="209550"/>
+                  </a:xfrm>
+                  <a:prstGeom prst="rect">
+                    <a:avLst/>
+                  </a:prstGeom>
+                </pic:spPr>
+              </pic:pic>
+            </a:graphicData>
+          </a:graphic>
+        </wp:inline>
+      </w:drawing>
+    </w:r>
     <w:r>
       <w:rPr>
         <w:color w:val="5B6770"/>
         <w:sz w:val="16"/>
         <w:szCs w:val="16"/>
       </w:rPr>
+      <w:ptab w:alignment="right" w:relativeTo="margin" w:leader="none"/>
       <w:t xml:space="preserve">Agentic GRC on SAS — Response to proposal</w:t>
     </w:r>
   </w:p>

</xml_diff>